<commit_message>
Corriger le titre M1 : Bioinformaticien → Data Scientist
</commit_message>
<xml_diff>
--- a/docs/AquaVigil_WA_Plan_Travail_v1.0.docx
+++ b/docs/AquaVigil_WA_Plan_Travail_v1.0.docx
@@ -619,7 +619,7 @@
                 <w:sz w:val="30"/>
                 <w:szCs w:val="30"/>
               </w:rPr>
-              <w:t xml:space="preserve">Membre 1 — Coordinateur Bioinformatique &amp; Chef de Projet</w:t>
+              <w:t>Membre 1 — Chef de Projet &amp; Chef de Projet</w:t>
             </w:r>
           </w:p>
           <w:p>
@@ -635,7 +635,7 @@
                 <w:sz w:val="20"/>
                 <w:szCs w:val="20"/>
               </w:rPr>
-              <w:t xml:space="preserve">Data Scientist — Coordinateur Bioinformatique &amp; Chef de Projet</w:t>
+              <w:t>Data Scientist — Chef de Projet &amp; Chef de Projet</w:t>
             </w:r>
           </w:p>
         </w:tc>

</xml_diff>